<commit_message>
Document hard-to-read photos going to review, and test it
Update the comments, API field descriptions, README, integration guide
and system overview (text and Figure 2) for glare, unclear-digit and
low-confidence photos now coming back as NEEDS_REVIEW instead of RETAKE.
The sentence returned with a retake that has no reading now describes a
wrong photo.

Add API tests: a retake still returns the model's reading, low-confidence
and unreadable photos go to review, and a reading with a "?" can only be
corrected, not confirmed.

Co-Authored-By: Claude Opus 5.5 <noreply@anthropic.com>
</commit_message>
<xml_diff>
--- a/services/elm-ocr/docs/Meter_Reader_System_Overview.docx
+++ b/services/elm-ocr/docs/Meter_Reader_System_Overview.docx
@@ -33,6 +33,26 @@
           <w:sz w:val="18"/>
         </w:rPr>
         <w:t>Version 1.0, 8 October 2026  |  Prepared by the GPT-vision project team  |  Repository folder meter_reader_service/ (main branch, commit 3eeee9b)</w:t>
+      </w:r>
+    </w:p>
+    <w:p>
+      <w:pPr>
+        <w:spacing w:after="200"/>
+      </w:pPr>
+      <w:r>
+        <w:rPr>
+          <w:b/>
+          <w:color w:val="1F4E79"/>
+          <w:sz w:val="18"/>
+        </w:rPr>
+        <w:t xml:space="preserve">Update, 15 October 2026: </w:t>
+      </w:r>
+      <w:r>
+        <w:rPr>
+          <w:color w:val="52606D"/>
+          <w:sz w:val="18"/>
+        </w:rPr>
+        <w:t>hard-to-read photos (glare, an unclear digit, low confidence) now come back as REVIEW instead of RETAKE, with the model's reading for a person to check; the outcome table, Figure 2 and the settings and accuracy notes below are updated to match. The service now lives in services/elm-ocr of the arghyam/flowvision repository and is also served under /flowvision/v1/elm; its docs/INTEGRATION.md is the current API reference.</w:t>
       </w:r>
     </w:p>
     <w:p>
@@ -1482,7 +1502,7 @@
           <w:color w:val="8A1C3B"/>
           <w:sz w:val="19"/>
         </w:rPr>
-        <w:t>RETAKE</w:t>
+        <w:t>REVIEW</w:t>
       </w:r>
       <w:r>
         <w:rPr>
@@ -1870,7 +1890,7 @@
                 <w:b w:val="0"/>
                 <w:sz w:val="18"/>
               </w:rPr>
-              <w:t>Photo problem: glare, unclear digit, low confidence, wrong screen, no unit visible, no meter</w:t>
+              <w:t>Wrong photo: wrong screen, no unit visible, wrong unit, no meter</w:t>
             </w:r>
           </w:p>
         </w:tc>
@@ -1999,7 +2019,7 @@
                 <w:b w:val="0"/>
                 <w:sz w:val="18"/>
               </w:rPr>
-              <w:t>A person must confirm: a consistency check failed (digit count, previous reading) or the reading could not be cross-checked</w:t>
+              <w:t>A person must confirm: the photo was hard to read (glare, unclear digit, low confidence), a consistency check failed (digit count, previous reading), or the reading could not be cross-checked</w:t>
             </w:r>
           </w:p>
         </w:tc>
@@ -3917,7 +3937,7 @@
         <w:rPr>
           <w:b w:val="0"/>
         </w:rPr>
-        <w:t xml:space="preserve"> reading, becomes one too, so the consumer's next photo is checked against it. If the same consumer sends the identical photo again after its reading was corrected, it is not read again and goes to </w:t>
+        <w:t xml:space="preserve"> reading, becomes one too (a REVIEW reading that holds a ? needs the corrected value), so the consumer's next photo is checked against it. If the same consumer sends the identical photo again after its reading was corrected, it is not read again and goes to </w:t>
       </w:r>
       <w:r>
         <w:rPr>
@@ -8007,7 +8027,7 @@
         <w:rPr>
           <w:b w:val="0"/>
         </w:rPr>
-        <w:t xml:space="preserve"> is honoured after the screen-type and label checks but before row 3's unit check, and two decimal points are checked after the unit. Rows 9-12 then combine the reads.</w:t>
+        <w:t xml:space="preserve"> is honoured after the screen-type and label checks, before row 3's unit check (an unreadable answer whose unit names another quantity, such as kW, V or kVArh, is still WRONG_SCREEN), and two decimal points are checked after the unit. Rows 9-12 then combine the reads.</w:t>
       </w:r>
     </w:p>
     <w:tbl>
@@ -8400,7 +8420,23 @@
                 <w:b w:val="0"/>
                 <w:sz w:val="18"/>
               </w:rPr>
-              <w:t xml:space="preserve">, </w:t>
+              <w:t xml:space="preserve">); </w:t>
+            </w:r>
+            <w:r>
+              <w:rPr>
+                <w:rFonts w:ascii="Consolas" w:hAnsi="Consolas" w:eastAsia="Consolas"/>
+                <w:b w:val="0"/>
+                <w:color w:val="8A1C3B"/>
+                <w:sz w:val="16"/>
+              </w:rPr>
+              <w:t>REVIEW</w:t>
+            </w:r>
+            <w:r>
+              <w:rPr>
+                <w:b w:val="0"/>
+                <w:sz w:val="18"/>
+              </w:rPr>
+              <w:t xml:space="preserve"> (</w:t>
             </w:r>
             <w:r>
               <w:rPr>
@@ -8665,7 +8701,7 @@
                 <w:color w:val="8A1C3B"/>
                 <w:sz w:val="16"/>
               </w:rPr>
-              <w:t>RETAKE</w:t>
+              <w:t>REVIEW</w:t>
             </w:r>
             <w:r>
               <w:rPr>
@@ -8921,7 +8957,7 @@
                 <w:color w:val="8A1C3B"/>
                 <w:sz w:val="16"/>
               </w:rPr>
-              <w:t>RETAKE</w:t>
+              <w:t>REVIEW</w:t>
             </w:r>
             <w:r>
               <w:rPr>
@@ -15834,7 +15870,7 @@
                 <w:color w:val="8A1C3B"/>
                 <w:sz w:val="16"/>
               </w:rPr>
-              <w:t>RETAKE</w:t>
+              <w:t>REVIEW</w:t>
             </w:r>
           </w:p>
         </w:tc>
@@ -18832,7 +18868,7 @@
         <w:rPr>
           <w:b w:val="0"/>
         </w:rPr>
-        <w:t>, which is the safe outcome.</w:t>
+        <w:t>, the safe outcome under the rules of that date (hard-to-read photos now go to REVIEW).</w:t>
       </w:r>
     </w:p>
     <w:p>

</xml_diff>

<commit_message>
ELM docs: describe both providers (GPT-6 Sol or Claude Sonnet 5.5)
README title, intro, quick start, cost and timing, and the read step now
cover METER_PROVIDER=claude. DEPLOY_AWS.md says "the provider" where
billing and key rotation apply to both. The system overview gets a dated
note on choosing the provider, and its outdated paragraph ("startup
still requires OPENAI_API_KEY") and METER_MODEL row are corrected.

Co-Authored-By: Claude Opus 5.5 <noreply@anthropic.com>
</commit_message>
<xml_diff>
--- a/services/elm-ocr/docs/Meter_Reader_System_Overview.docx
+++ b/services/elm-ocr/docs/Meter_Reader_System_Overview.docx
@@ -53,6 +53,26 @@
           <w:sz w:val="18"/>
         </w:rPr>
         <w:t>hard-to-read photos (glare, an unclear digit, low confidence) now come back as REVIEW instead of RETAKE, with the model's reading for a person to check; the outcome table, Figure 2 and the settings and accuracy notes below are updated to match. The service now lives in services/elm-ocr of the arghyam/flowvision repository and is also served under /flowvision/v1/elm; its docs/INTEGRATION.md is the current API reference, including which request fields are required and every possible outcome with the exact messages returned.</w:t>
+      </w:r>
+    </w:p>
+    <w:p>
+      <w:pPr>
+        <w:spacing w:after="200"/>
+      </w:pPr>
+      <w:r>
+        <w:rPr>
+          <w:b/>
+          <w:color w:val="1F4E79"/>
+          <w:sz w:val="18"/>
+        </w:rPr>
+        <w:t xml:space="preserve">Update, 21 October 2026: </w:t>
+      </w:r>
+      <w:r>
+        <w:rPr>
+          <w:color w:val="52606D"/>
+          <w:sz w:val="18"/>
+        </w:rPr>
+        <w:t>the model that reads the photos is now chosen with METER_PROVIDER: openai (GPT-6 Sol, the default, as described below) or claude (Claude Sonnet 5.5, through Anthropic's API with ANTHROPIC_API_KEY). Only the chosen model reads a photo; no other model is tried. Where this document says OpenAI or GPT-6 Sol, the same applies to Anthropic and Claude when Claude is chosen. Sending consumer photos to Anthropic needs its own data-sharing approval.</w:t>
       </w:r>
     </w:p>
     <w:p>
@@ -14291,7 +14311,7 @@
         <w:rPr>
           <w:b w:val="0"/>
         </w:rPr>
-        <w:t xml:space="preserve">Choosing the provider needs a new setting and key, read in </w:t>
+        <w:t xml:space="preserve">The provider is chosen with </w:t>
       </w:r>
       <w:r>
         <w:rPr>
@@ -14300,13 +14320,13 @@
           <w:color w:val="8A1C3B"/>
           <w:sz w:val="19"/>
         </w:rPr>
-        <w:t>app_factory.py</w:t>
-      </w:r>
-      <w:r>
-        <w:rPr>
-          <w:b w:val="0"/>
-        </w:rPr>
-        <w:t xml:space="preserve"> and </w:t>
+        <w:t xml:space="preserve">METER_PROVIDER</w:t>
+      </w:r>
+      <w:r>
+        <w:rPr>
+          <w:b w:val="0"/>
+        </w:rPr>
+        <w:t xml:space="preserve"> (</w:t>
       </w:r>
       <w:r>
         <w:rPr>
@@ -14315,13 +14335,13 @@
           <w:color w:val="8A1C3B"/>
           <w:sz w:val="19"/>
         </w:rPr>
-        <w:t>scripts/evaluate.py</w:t>
-      </w:r>
-      <w:r>
-        <w:rPr>
-          <w:b w:val="0"/>
-        </w:rPr>
-        <w:t xml:space="preserve"> (which otherwise always uses OpenAI); startup still requires </w:t>
+        <w:t xml:space="preserve">openai</w:t>
+      </w:r>
+      <w:r>
+        <w:rPr>
+          <w:b w:val="0"/>
+        </w:rPr>
+        <w:t xml:space="preserve"> or </w:t>
       </w:r>
       <w:r>
         <w:rPr>
@@ -14330,13 +14350,58 @@
           <w:color w:val="8A1C3B"/>
           <w:sz w:val="19"/>
         </w:rPr>
-        <w:t>OPENAI_API_KEY</w:t>
-      </w:r>
-      <w:r>
-        <w:rPr>
-          <w:b w:val="0"/>
-        </w:rPr>
-        <w:t xml:space="preserve"> today. Another company also needs fresh data-sharing approval.</w:t>
+        <w:t xml:space="preserve">claude</w:t>
+      </w:r>
+      <w:r>
+        <w:rPr>
+          <w:b w:val="0"/>
+        </w:rPr>
+        <w:t xml:space="preserve">) and needs only that provider's key: </w:t>
+      </w:r>
+      <w:r>
+        <w:rPr>
+          <w:rFonts w:ascii="Consolas" w:hAnsi="Consolas" w:eastAsia="Consolas"/>
+          <w:b w:val="0"/>
+          <w:color w:val="8A1C3B"/>
+          <w:sz w:val="19"/>
+        </w:rPr>
+        <w:t xml:space="preserve">OPENAI_API_KEY</w:t>
+      </w:r>
+      <w:r>
+        <w:rPr>
+          <w:b w:val="0"/>
+        </w:rPr>
+        <w:t xml:space="preserve"> or </w:t>
+      </w:r>
+      <w:r>
+        <w:rPr>
+          <w:rFonts w:ascii="Consolas" w:hAnsi="Consolas" w:eastAsia="Consolas"/>
+          <w:b w:val="0"/>
+          <w:color w:val="8A1C3B"/>
+          <w:sz w:val="19"/>
+        </w:rPr>
+        <w:t xml:space="preserve">ANTHROPIC_API_KEY</w:t>
+      </w:r>
+      <w:r>
+        <w:rPr>
+          <w:b w:val="0"/>
+        </w:rPr>
+        <w:t xml:space="preserve">; </w:t>
+      </w:r>
+      <w:r>
+        <w:rPr>
+          <w:rFonts w:ascii="Consolas" w:hAnsi="Consolas" w:eastAsia="Consolas"/>
+          <w:b w:val="0"/>
+          <w:color w:val="8A1C3B"/>
+          <w:sz w:val="19"/>
+        </w:rPr>
+        <w:t xml:space="preserve">scripts/evaluate.py</w:t>
+      </w:r>
+      <w:r>
+        <w:rPr>
+          <w:b w:val="0"/>
+        </w:rPr>
+        <w:t xml:space="preserve"> follows the same setting. Another company also needs fresh data-sharing approval.</w:t>
       </w:r>
     </w:p>
     <w:p>
@@ -15589,7 +15654,7 @@
                 <w:b w:val="0"/>
                 <w:sz w:val="18"/>
               </w:rPr>
-              <w:t>OpenAI model; the only one tested for the service</w:t>
+              <w:t>Model of the provider in use: gpt-6-sol (OpenAI, the only one evaluated on the trial photos), or claude-sonnet-5-5 with METER_PROVIDER=claude</w:t>
             </w:r>
           </w:p>
         </w:tc>

</xml_diff>

<commit_message>
ELM: reject history (H) and billing (B1) screen labels
A screen label with H (alone or H1..H12, in any spacing: H 1, H-1, H01)
or B with a number (B1..B12) now marks the wrong screen (WRONG_SCREEN,
retake). The unit's own h (kWh, kW h, kW·h, kVA h) and the R Y B phase
indicator, including a lone B when a phase is out, stay accepted. Tests
cover both sides; README, INTEGRATION.md and the overview list the labels.

Co-Authored-By: Claude Opus 5.5 <noreply@anthropic.com>
</commit_message>
<xml_diff>
--- a/services/elm-ocr/docs/Meter_Reader_System_Overview.docx
+++ b/services/elm-ocr/docs/Meter_Reader_System_Overview.docx
@@ -1430,7 +1430,7 @@
         <w:rPr>
           <w:b w:val="0"/>
         </w:rPr>
-        <w:t xml:space="preserve"> only the cumulative total counts. Tariff zones (T1, T2, TOD), bill-history screens (01 BILL), maximum demand (MD) and prepaid balance screens look similar but are never accepted: they come back as </w:t>
+        <w:t xml:space="preserve"> only the cumulative total counts. Tariff zones (T1, T2, TOD), bill-history screens (01 BILL), history and billing registers (H, H1, B1), maximum demand (MD) and prepaid balance screens look similar but are never accepted: they come back as </w:t>
       </w:r>
       <w:r>
         <w:rPr>
@@ -8580,7 +8580,7 @@
                 <w:b w:val="0"/>
                 <w:sz w:val="18"/>
               </w:rPr>
-              <w:t xml:space="preserve"> matches the tariff/TOD, bill-history, maximum-demand or prepaid pattern; or the unit is not kWh or kVAh (for example kW, V or kVArh)</w:t>
+              <w:t xml:space="preserve"> matches the tariff/TOD, bill-history, history or billing (H, H1, B1), maximum-demand or prepaid pattern; or the unit is not kWh or kVAh (for example kW, V or kVArh)</w:t>
             </w:r>
           </w:p>
         </w:tc>

</xml_diff>